<commit_message>
altered structure and solved some problems !!
</commit_message>
<xml_diff>
--- a/02-control-flow/problems/controlflow_problems.docx
+++ b/02-control-flow/problems/controlflow_problems.docx
@@ -41,6 +41,10 @@
           <w:ilvl w:val="0"/>
           <w:numId w:val="1"/>
         </w:numPr>
+        <w:tabs>
+          <w:tab w:val="clear" w:pos="360"/>
+          <w:tab w:val="num" w:pos="720"/>
+        </w:tabs>
       </w:pPr>
       <w:r>
         <w:t>Positive, Negative or Zero</w:t>
@@ -66,6 +70,10 @@
           <w:ilvl w:val="0"/>
           <w:numId w:val="1"/>
         </w:numPr>
+        <w:tabs>
+          <w:tab w:val="clear" w:pos="360"/>
+          <w:tab w:val="num" w:pos="720"/>
+        </w:tabs>
       </w:pPr>
       <w:r>
         <w:t>Even or Odd</w:t>
@@ -91,6 +99,10 @@
           <w:ilvl w:val="0"/>
           <w:numId w:val="1"/>
         </w:numPr>
+        <w:tabs>
+          <w:tab w:val="clear" w:pos="360"/>
+          <w:tab w:val="num" w:pos="720"/>
+        </w:tabs>
       </w:pPr>
       <w:r>
         <w:t>Largest of Two Numbers</w:t>
@@ -116,6 +128,10 @@
           <w:ilvl w:val="0"/>
           <w:numId w:val="1"/>
         </w:numPr>
+        <w:tabs>
+          <w:tab w:val="clear" w:pos="360"/>
+          <w:tab w:val="num" w:pos="720"/>
+        </w:tabs>
       </w:pPr>
       <w:r>
         <w:t>Voting Eligibility</w:t>
@@ -141,6 +157,10 @@
           <w:ilvl w:val="0"/>
           <w:numId w:val="1"/>
         </w:numPr>
+        <w:tabs>
+          <w:tab w:val="clear" w:pos="360"/>
+          <w:tab w:val="num" w:pos="720"/>
+        </w:tabs>
       </w:pPr>
       <w:r>
         <w:t>Pass or Fail</w:t>
@@ -166,6 +186,10 @@
           <w:ilvl w:val="0"/>
           <w:numId w:val="1"/>
         </w:numPr>
+        <w:tabs>
+          <w:tab w:val="clear" w:pos="360"/>
+          <w:tab w:val="num" w:pos="720"/>
+        </w:tabs>
       </w:pPr>
       <w:r>
         <w:t>Divisible by 5</w:t>
@@ -191,6 +215,10 @@
           <w:ilvl w:val="0"/>
           <w:numId w:val="1"/>
         </w:numPr>
+        <w:tabs>
+          <w:tab w:val="clear" w:pos="360"/>
+          <w:tab w:val="num" w:pos="720"/>
+        </w:tabs>
       </w:pPr>
       <w:r>
         <w:t>Divisible by 3 and 5</w:t>
@@ -216,6 +244,10 @@
           <w:ilvl w:val="0"/>
           <w:numId w:val="1"/>
         </w:numPr>
+        <w:tabs>
+          <w:tab w:val="clear" w:pos="360"/>
+          <w:tab w:val="num" w:pos="720"/>
+        </w:tabs>
       </w:pPr>
       <w:r>
         <w:t>Uppercase or Lowercase Character</w:t>
@@ -241,6 +273,10 @@
           <w:ilvl w:val="0"/>
           <w:numId w:val="1"/>
         </w:numPr>
+        <w:tabs>
+          <w:tab w:val="clear" w:pos="360"/>
+          <w:tab w:val="num" w:pos="720"/>
+        </w:tabs>
       </w:pPr>
       <w:r>
         <w:t>Leap Year Checker</w:t>
@@ -266,6 +302,10 @@
           <w:ilvl w:val="0"/>
           <w:numId w:val="1"/>
         </w:numPr>
+        <w:tabs>
+          <w:tab w:val="clear" w:pos="360"/>
+          <w:tab w:val="num" w:pos="720"/>
+        </w:tabs>
       </w:pPr>
       <w:r>
         <w:t>Greatest of Three Numbers</w:t>
@@ -1479,9 +1519,9 @@
       <w:lvlJc w:val="left"/>
       <w:pPr>
         <w:tabs>
-          <w:tab w:val="num" w:pos="720"/>
-        </w:tabs>
-        <w:ind w:left="720" w:hanging="360"/>
+          <w:tab w:val="num" w:pos="360"/>
+        </w:tabs>
+        <w:ind w:left="360" w:hanging="360"/>
       </w:pPr>
     </w:lvl>
     <w:lvl w:ilvl="1" w:tentative="1">
@@ -1491,9 +1531,9 @@
       <w:lvlJc w:val="left"/>
       <w:pPr>
         <w:tabs>
-          <w:tab w:val="num" w:pos="1440"/>
-        </w:tabs>
-        <w:ind w:left="1440" w:hanging="360"/>
+          <w:tab w:val="num" w:pos="1080"/>
+        </w:tabs>
+        <w:ind w:left="1080" w:hanging="360"/>
       </w:pPr>
     </w:lvl>
     <w:lvl w:ilvl="2" w:tentative="1">
@@ -1503,9 +1543,9 @@
       <w:lvlJc w:val="left"/>
       <w:pPr>
         <w:tabs>
-          <w:tab w:val="num" w:pos="2160"/>
-        </w:tabs>
-        <w:ind w:left="2160" w:hanging="360"/>
+          <w:tab w:val="num" w:pos="1800"/>
+        </w:tabs>
+        <w:ind w:left="1800" w:hanging="360"/>
       </w:pPr>
     </w:lvl>
     <w:lvl w:ilvl="3" w:tentative="1">
@@ -1515,9 +1555,9 @@
       <w:lvlJc w:val="left"/>
       <w:pPr>
         <w:tabs>
-          <w:tab w:val="num" w:pos="2880"/>
-        </w:tabs>
-        <w:ind w:left="2880" w:hanging="360"/>
+          <w:tab w:val="num" w:pos="2520"/>
+        </w:tabs>
+        <w:ind w:left="2520" w:hanging="360"/>
       </w:pPr>
     </w:lvl>
     <w:lvl w:ilvl="4" w:tentative="1">
@@ -1527,9 +1567,9 @@
       <w:lvlJc w:val="left"/>
       <w:pPr>
         <w:tabs>
-          <w:tab w:val="num" w:pos="3600"/>
-        </w:tabs>
-        <w:ind w:left="3600" w:hanging="360"/>
+          <w:tab w:val="num" w:pos="3240"/>
+        </w:tabs>
+        <w:ind w:left="3240" w:hanging="360"/>
       </w:pPr>
     </w:lvl>
     <w:lvl w:ilvl="5" w:tentative="1">
@@ -1539,9 +1579,9 @@
       <w:lvlJc w:val="left"/>
       <w:pPr>
         <w:tabs>
-          <w:tab w:val="num" w:pos="4320"/>
-        </w:tabs>
-        <w:ind w:left="4320" w:hanging="360"/>
+          <w:tab w:val="num" w:pos="3960"/>
+        </w:tabs>
+        <w:ind w:left="3960" w:hanging="360"/>
       </w:pPr>
     </w:lvl>
     <w:lvl w:ilvl="6" w:tentative="1">
@@ -1551,9 +1591,9 @@
       <w:lvlJc w:val="left"/>
       <w:pPr>
         <w:tabs>
-          <w:tab w:val="num" w:pos="5040"/>
-        </w:tabs>
-        <w:ind w:left="5040" w:hanging="360"/>
+          <w:tab w:val="num" w:pos="4680"/>
+        </w:tabs>
+        <w:ind w:left="4680" w:hanging="360"/>
       </w:pPr>
     </w:lvl>
     <w:lvl w:ilvl="7" w:tentative="1">
@@ -1563,9 +1603,9 @@
       <w:lvlJc w:val="left"/>
       <w:pPr>
         <w:tabs>
-          <w:tab w:val="num" w:pos="5760"/>
-        </w:tabs>
-        <w:ind w:left="5760" w:hanging="360"/>
+          <w:tab w:val="num" w:pos="5400"/>
+        </w:tabs>
+        <w:ind w:left="5400" w:hanging="360"/>
       </w:pPr>
     </w:lvl>
     <w:lvl w:ilvl="8" w:tentative="1">
@@ -1575,9 +1615,9 @@
       <w:lvlJc w:val="left"/>
       <w:pPr>
         <w:tabs>
-          <w:tab w:val="num" w:pos="6480"/>
-        </w:tabs>
-        <w:ind w:left="6480" w:hanging="360"/>
+          <w:tab w:val="num" w:pos="6120"/>
+        </w:tabs>
+        <w:ind w:left="6120" w:hanging="360"/>
       </w:pPr>
     </w:lvl>
   </w:abstractNum>

</xml_diff>